<commit_message>
MB001 #388: atomic correction candidate
</commit_message>
<xml_diff>
--- a/products-storage/02-dopraboty-bez-poter/00-INSTRUKCIYA.docx
+++ b/products-storage/02-dopraboty-bez-poter/00-INSTRUKCIYA.docx
@@ -65,7 +65,7 @@
         <w:ind w:left="454" w:hanging="454"/>
       </w:pPr>
       <w:r>
-        <w:t>1. Зафиксируйте просьбу письменно: 03-uvedomlenie-o-doprabotah.docx — уведомление заказчику о выявленной работе с просьбой до указанной даты согласовать объём, цену и влияние на срок.</w:t>
+        <w:t>1. Зафиксируйте просьбу письменно: 03-uvedomlenie-o-doprabotah.docx — уведомление заказчику о выявленной работе с просьбой до указанной даты согласовать объём, цену и влияние на срок. В уведомлении оставьте строку «выявлена [дата] при [обстоятельства]», строку «выполнена с [дата] по [дата] по просьбе [кто просил]» удалите. В блоке «Режим до решения» оставьте ровно один вариант — «Работа не начинается» или «выполняются только необходимые меры по предотвращению ущерба по отдельной фиксации», второй вариант и косую черту удалите. Строку «Приложения» заполните, если что-то прикладываете, иначе удалите.</w:t>
       </w:r>
     </w:p>
     <w:p>
@@ -195,7 +195,7 @@
         <w:ind w:left="454" w:hanging="454"/>
       </w:pPr>
       <w:r>
-        <w:t>6. Направьте заказчику 03-uvedomlenie-o-doprabotah.docx: когда и по чьей просьбе выполнен объём, приложения — 02 и расчёт из 07, просьба согласовать объём и цену до указанной даты. Блок «Режим до решения» в этом случае удалите: работы уже выполнены.</w:t>
+        <w:t>6. Направьте заказчику 03-uvedomlenie-o-doprabotah.docx: когда и по чьей просьбе выполнен объём, приложения — 02 и расчёт из 07, просьба согласовать объём и цену до указанной даты. Оставьте строку «выполнена с [дата] по [дата] по просьбе [кто просил]» — что выполнено и чем это подтверждается, строку «выявлена [дата] при [обстоятельства]» удалите. В строке «Приложения» перечислите 02 и расчёт из 07. Блок «Режим до решения» в этом случае удалите целиком — заголовок и строку под ним: работы уже выполнены.</w:t>
       </w:r>
     </w:p>
     <w:p>
@@ -885,6 +885,14 @@
         <w:pStyle w:val="ListBullet"/>
       </w:pPr>
       <w:r>
+        <w:t>В 03 оставьте строки только своего случая — раздел 2, шаг 1 или раздел 3, шаг 6. В отправляемом уведомлении не должно остаться ни квадратных скобок, ни второго варианта на выбор.</w:t>
+      </w:r>
+    </w:p>
+    <w:p>
+      <w:pPr>
+        <w:pStyle w:val="ListBullet"/>
+      </w:pPr>
+      <w:r>
         <w:t>В 02, 04, 05, 11 и 12 удалите строку-подсказку под заголовком, таблицу «Контроль перед использованием» и оговорку «Важно: шаблон не заменяет…» — это пометки для вас, второй стороне они не нужны.</w:t>
       </w:r>
     </w:p>

</xml_diff>

<commit_message>
P2: rebuild remaining forms, calculation, journal and buyer instructions
</commit_message>
<xml_diff>
--- a/products-storage/02-dopraboty-bez-poter/00-INSTRUKCIYA.docx
+++ b/products-storage/02-dopraboty-bez-poter/00-INSTRUKCIYA.docx
@@ -65,7 +65,7 @@
         <w:ind w:left="454" w:hanging="454"/>
       </w:pPr>
       <w:r>
-        <w:t>1. Зафиксируйте просьбу письменно: 03-uvedomlenie-o-doprabotah.docx — уведомление заказчику о выявленной работе с просьбой до указанной даты согласовать объём, цену и влияние на срок. В уведомлении оставьте строку «выявлена [дата] при [обстоятельства]», строку «выполнена с [дата] по [дата] по просьбе [кто просил]» удалите. В блоке «Режим до решения» оставьте ровно один вариант — «Работа не начинается» или «выполняются только необходимые меры по предотвращению ущерба по отдельной фиксации», второй вариант и косую черту удалите. Строку «Приложения» заполните, если что-то прикладываете, иначе удалите.</w:t>
+        <w:t>1. Зафиксируйте просьбу письменно: 03-uvedomlenie-o-doprabotah.docx — уведомление заказчику о выявленной работе и запросе решения. Выберите маршрут А, заполните фактические реквизиты, состав объёма, срок ответа, статус участка и приложения. Маршрут Б перед отправкой удалите.</w:t>
       </w:r>
     </w:p>
     <w:p>
@@ -73,7 +73,7 @@
         <w:ind w:left="454" w:hanging="454"/>
       </w:pPr>
       <w:r>
-        <w:t>2. Отделите дополнительный объём от договорного и опишите его: 02-soglasovanie-obema.docx — причина, отличие от исходного объёма, наименование, единица, количество, эскиз или дефектная ведомость.</w:t>
+        <w:t>2. Отделите дополнительный объём от договорного и опишите его: 02-soglasovanie-obema.docx — причина, отличие от исходного объёма, границы, единица, количество и подтверждающий документ. Выберите маршрут А и удалите маршрут Б в отправляемом экземпляре.</w:t>
       </w:r>
     </w:p>
     <w:p>
@@ -97,7 +97,7 @@
         <w:ind w:left="454" w:hanging="454"/>
       </w:pPr>
       <w:r>
-        <w:t>5. Получите письменное поручение до начала работ: 01-prikaz-na-dopobem.docx — кто поручает, что, где, в каком объёме, в какой срок, по какой цене и как будет приёмка. Проверьте, что подписывает лицо с полномочиями по вашему договору.</w:t>
+        <w:t>5. Получите письменное поручение до начала работ: 01-prikaz-na-dopobem.docx — кто поручает, что, где, в каком объёме, где зафиксированы цена, срок и приёмка. Проверьте, что подписывает лицо с полномочиями по вашему договору.</w:t>
       </w:r>
     </w:p>
     <w:p>
@@ -113,7 +113,7 @@
         <w:ind w:left="454" w:hanging="454"/>
       </w:pPr>
       <w:r>
-        <w:t>7. Если к указанной дате ответа нет, а продолжать без решения нельзя, — 06-pismo-o-priostanovke.docx. Основание и допустимость приостановки сверьте с условиями договора до отправки.</w:t>
+        <w:t>7. Если ответа нет по применимому сроку и соответствующие работы приостановлены — 06-pismo-o-priostanovke.docx. Укажите точные позиции, дату, меры сохранности и подтверждение доставки уведомления 03.</w:t>
       </w:r>
     </w:p>
     <w:p>
@@ -187,7 +187,7 @@
         <w:ind w:left="454" w:hanging="454"/>
       </w:pPr>
       <w:r>
-        <w:t>5. Опишите объём в 02-soglasovanie-obema.docx (в поле «Способ подтверждения факта» — ссылки на собранное) и посчитайте цену в 07-raschet-stoimosti.xlsx.</w:t>
+        <w:t>5. Опишите объём в 02-soglasovanie-obema.docx (маршрут Б: фактический период, просьба заказчика и подтверждения по позициям) и посчитайте цену в 07-raschet-stoimosti.xlsx.</w:t>
       </w:r>
     </w:p>
     <w:p>
@@ -195,7 +195,7 @@
         <w:ind w:left="454" w:hanging="454"/>
       </w:pPr>
       <w:r>
-        <w:t>6. Направьте заказчику 03-uvedomlenie-o-doprabotah.docx: когда и по чьей просьбе выполнен объём, приложения — 02 и расчёт из 07, просьба согласовать объём и цену до указанной даты. Оставьте строку «выполнена с [дата] по [дата] по просьбе [кто просил]» — что выполнено и чем это подтверждается, строку «выявлена [дата] при [обстоятельства]» удалите. В строке «Приложения» перечислите 02 и расчёт из 07. Блок «Режим до решения» в этом случае удалите целиком — заголовок и строку под ним: работы уже выполнены.</w:t>
+        <w:t>6. Направьте заказчику 03-uvedomlenie-o-doprabotah.docx: когда и по чьей просьбе выполнен объём, приложения — 02 и расчёт из 07, просьба согласовать объём и цену. Выберите маршрут Б с фактическими датами и документами; удалите маршрут А и относящиеся к нему поля. В приложениях укажите 02, расчёт 07 и подтверждения выполнения. Не меняйте дату уже выполненных работ и дату текущего уведомления.</w:t>
       </w:r>
     </w:p>
     <w:p>
@@ -211,7 +211,7 @@
         <w:ind w:left="454" w:hanging="454"/>
       </w:pPr>
       <w:r>
-        <w:t>8. Заказчик подписал — включите объём в закрывающие документы и отметьте в журнале «Включено в КС-2» и «Оплачено».</w:t>
+        <w:t>8. После подписания оформите приёмочные документы по договору и отметьте в журнале включение в КС-2 и фактическое поступление оплаты отдельно.</w:t>
       </w:r>
     </w:p>
     <w:p>
@@ -728,7 +728,7 @@
           </w:tcPr>
           <w:p>
             <w:r>
-              <w:t>Общий порядок работы на одной странице</w:t>
+              <w:t>Два маршрута и контрольный порядок</w:t>
             </w:r>
           </w:p>
         </w:tc>
@@ -875,7 +875,7 @@
         <w:pStyle w:val="ListBullet"/>
       </w:pPr>
       <w:r>
-        <w:t>Формы 01–06, 11 и 12 — содержательная часть. Реквизиты сторон, номер и дату договора и подписные блоки добавьте по своему договору и проверьте полномочия подписантов.</w:t>
+        <w:t>Проверьте заполненные реквизиты сторон, договора, объекта, даты, подписи, полномочия подписантов и приложения в формах 01–06, 11 и 12.</w:t>
       </w:r>
     </w:p>
     <w:p>
@@ -891,7 +891,7 @@
         <w:pStyle w:val="ListBullet"/>
       </w:pPr>
       <w:r>
-        <w:t>В 03 оставьте строки только своего случая — раздел 2, шаг 1 или раздел 3, шаг 6. В отправляемом уведомлении не должно остаться ни квадратных скобок, ни второго варианта на выбор.</w:t>
+        <w:t>В формах 02, 03 и 11 оставьте только выбранный маршрут и относящиеся к нему заполненные сведения. В направляемых документах не должно остаться квадратных скобок и второго варианта на выбор.</w:t>
       </w:r>
     </w:p>
     <w:p>
@@ -1656,9 +1656,6 @@
     <w:qFormat/>
     <w:rsid w:val="00FC693F"/>
     <w:pPr>
-      <w:pBdr>
-        <w:bottom w:val="single" w:sz="8" w:space="4" w:color="4F81BD" w:themeColor="accent1"/>
-      </w:pBdr>
       <w:spacing w:after="300" w:line="240" w:lineRule="auto"/>
       <w:contextualSpacing/>
     </w:pPr>
@@ -1667,7 +1664,7 @@
       <w:color w:val="2D3033"/>
       <w:spacing w:val="5"/>
       <w:kern w:val="28"/>
-      <w:sz w:val="52"/>
+      <w:sz w:val="40"/>
       <w:szCs w:val="52"/>
     </w:rPr>
   </w:style>

</xml_diff>

<commit_message>
Clarify P2 notice routes, conditional forms, and buyer instructions
</commit_message>
<xml_diff>
--- a/products-storage/02-dopraboty-bez-poter/00-INSTRUKCIYA.docx
+++ b/products-storage/02-dopraboty-bez-poter/00-INSTRUKCIYA.docx
@@ -203,7 +203,7 @@
         <w:ind w:left="454" w:hanging="454"/>
       </w:pPr>
       <w:r>
-        <w:t>7. Предложите оформить объём допсоглашением 11-dopsoglashenie-obem-i-cena.docx — в разделе «Основание» перечислите, чем зафиксировано поручение. Если выполненные работы сдвинули сроки — 12-dopsoglashenie-sroki-doprabot.docx.</w:t>
+        <w:t>7. Предложите оформить объём допсоглашением 11-dopsoglashenie-obem-i-cena.docx — в п. 1 укажите фактическое подтверждение просьбы заказчика; поручение 01 оставьте только для планируемых работ. Если выполненные работы сдвинули сроки, сначала подготовьте обоснование 05, затем соглашение 12.</w:t>
       </w:r>
     </w:p>
     <w:p>
@@ -518,7 +518,7 @@
           </w:tcPr>
           <w:p>
             <w:r>
-              <w:t>Акт освидетельствования скрываемых работ</w:t>
+              <w:t>Акт освидетельствования скрытых работ</w:t>
             </w:r>
           </w:p>
         </w:tc>
@@ -553,7 +553,7 @@
           </w:tcPr>
           <w:p>
             <w:r>
-              <w:t>Расчёт влияния на срок и новая контрольная дата</w:t>
+              <w:t>Расчёт влияния на срок и предлагаемая контрольная дата</w:t>
             </w:r>
           </w:p>
         </w:tc>
@@ -566,7 +566,7 @@
               <w:jc w:val="center"/>
             </w:pPr>
             <w:r>
-              <w:t>А</w:t>
+              <w:t>А, Б</w:t>
             </w:r>
           </w:p>
         </w:tc>

</xml_diff>